<commit_message>
Add PEAR-SFT weighting ablation (paper/centered vs uniform)
Logs, summary CSV, and fig_sft_variants figure for the three cold-start
weighting modes; document why uniform ships (no reliable val gain, ~2x
gradient noise) across README, docs, and the paper.
</commit_message>
<xml_diff>
--- a/paper/SLM_Stacked_RL_Reasoning.docx
+++ b/paper/SLM_Stacked_RL_Reasoning.docx
@@ -506,12 +506,7 @@
         <w:spacing w:after="120"/>
       </w:pPr>
       <w:r>
-        <w:rPr>
-          <w:i w:val="0"/>
-          <w:color w:val="000000"/>
-          <w:sz w:val="21"/>
-        </w:rPr>
-        <w:t>We distil DeepSeek-R1-Distill-Qwen-32B (AWQ 4-bit) as teacher into Qwen2.5-7B as student. Because both share the Qwen2.5 vocabulary, a token-level PEAR weight delta_t = log pi_theta(t) - log pi_beta(t) is well defined [4]. A 32B specialist is far more confident than a 7B base model, so the raw weight is net-negative across reasoning tokens and decays toward exp(-10) early in each trace, which would train only the answer span and reproduce the StrategyQA format-drift failure. We therefore subtract the per-trace mean, which removes the global confidence offset while preserving within-trace relative agreement, clip symmetrically, and renormalise weights to unit mean so that traces of any length contribute equally. We also corrected a silent two-token misalignment by scoring both models on the same base-tokenised ids, which makes the teacher and student log-prob arrays equal length by construction. Following PEAR, we train for a single epoch at learning rate 1e-5 to avoid over-fitting the cold start. The shipped checkpoint uses the robust uniform-weight variant; the centered, raw, and negative-trace variants are retained as ablations.</w:t>
+        <w:t>We distil DeepSeek-R1-Distill-Qwen-32B (AWQ 4-bit) as teacher into Qwen2.5-7B as student. Because both share the Qwen2.5 vocabulary, a token-level PEAR weight delta_t = log pi_theta(t) - log pi_beta(t) is well defined [4]. A 32B specialist is far more confident than a 7B base model, so the raw weight is net-negative across reasoning tokens and decays toward exp(-10) early in each trace, which would train only the answer span and reproduce the StrategyQA format-drift failure. We therefore subtract the per-trace mean, which removes the global confidence offset while preserving within-trace relative agreement, clip symmetrically, and renormalise weights to unit mean so that traces of any length contribute equally. We also corrected a silent two-token misalignment by scoring both models on the same base-tokenised ids, which makes the teacher and student log-prob arrays equal length by construction. Following PEAR, we train for a single epoch at learning rate 1e-5 to avoid over-fitting the cold start. We ran the cold start three ways, identical except for the weighting mode: uniform (all token weights one), paper (the raw PEAR weight), and centered (per-trace mean-subtracted). The reweighting buys no reliable validation gain: paper reaches validation loss 0.536 against 0.552 for uniform, a gap within single-seed single-epoch noise, while centered is worse at 0.569. Yet it roughly doubles the gradient noise, with a steady-state gradient norm (steps 50 to 150) of 4.64 for paper and 3.50 for centered against 2.34 for uniform. On a one-epoch cold start whose sole purpose is a clean, low-variance launch point for RL, that trade is unfavourable and a mis-scaled per-token weight is unrecoverable, so the shipped checkpoint uses the uniform-weight variant and the centered, raw, and negative-trace variants are retained as ablations.</w:t>
       </w:r>
     </w:p>
     <w:p>

</xml_diff>